<commit_message>
feat: wire direct DeepSeek API for 5x cache savings
- Switch from OpenRouter to direct DeepSeek API (https://api.deepseek.com/v1)
- Cache hit: $0.028/M vs $0.14/M cache miss — 5x cheaper
- Handle V4 thinking mode: content vs reasoning_content fields
- Disable thinking for structured JSON output (extra_body)
- Increase max_tokens to 16384 for complex architecture prompts
- Auto-fallback to OpenRouter on DeepSeek auth failure (401)
- JSON parsing: trailing comma cleanup, truncated response recovery
- Full pipeline verified: 26K keywords → DeepSeek → 3 phases, 20 pages
- 11 KB DOCX strategy report generated with real AI content
</commit_message>
<xml_diff>
--- a/test-data/sasha-strategy-report.docx
+++ b/test-data/sasha-strategy-report.docx
@@ -116,12 +116,7 @@
         <w:pStyle w:val="Heading3"/>
       </w:pPr>
       <w:r>
-        <w:t xml:space="preserve">1. "pocket door frame kit"</w:t>
-      </w:r>
-    </w:p>
-    <w:p>
-      <w:r>
-        <w:t xml:space="preserve">   Volume: 1900 | SEO Score: 50 | Gap: 7.0 | Urgency: high</w:t>
+        <w:t xml:space="preserve">1. Commercial Pocket Door Hardware Systems | Heavy-Duty Sliding Door Solutions</w:t>
       </w:r>
     </w:p>
     <w:p>
@@ -129,20 +124,15 @@
         <w:spacing w:after="100"/>
       </w:pPr>
       <w:r>
-        <w:t xml:space="preserve">   Content weight: heaviest | Intent: Commercial</w:t>
-      </w:r>
-    </w:p>
-    <w:p>
-      <w:pPr>
-        <w:pStyle w:val="Heading3"/>
-      </w:pPr>
-      <w:r>
-        <w:t xml:space="preserve">2. "pocket door kit and door"</w:t>
-      </w:r>
-    </w:p>
-    <w:p>
-      <w:r>
-        <w:t xml:space="preserve">   Volume: 1900 | SEO Score: 50 | Gap: 7.0 | Urgency: high</w:t>
+        <w:t xml:space="preserve">   Content weight: heaviest | Intent: commercial</w:t>
+      </w:r>
+    </w:p>
+    <w:p>
+      <w:pPr>
+        <w:pStyle w:val="Heading3"/>
+      </w:pPr>
+      <w:r>
+        <w:t xml:space="preserve">2. Pocket Door Frame Kits for Commercial Construction | Spec-Grade Systems</w:t>
       </w:r>
     </w:p>
     <w:p>
@@ -150,20 +140,15 @@
         <w:spacing w:after="100"/>
       </w:pPr>
       <w:r>
-        <w:t xml:space="preserve">   Content weight: heaviest | Intent: Commercial</w:t>
-      </w:r>
-    </w:p>
-    <w:p>
-      <w:pPr>
-        <w:pStyle w:val="Heading3"/>
-      </w:pPr>
-      <w:r>
-        <w:t xml:space="preserve">3. "pocket door kit"</w:t>
-      </w:r>
-    </w:p>
-    <w:p>
-      <w:r>
-        <w:t xml:space="preserve">   Volume: 6600 | SEO Score: 50 | Gap: 7.0 | Urgency: high</w:t>
+        <w:t xml:space="preserve">   Content weight: heaviest | Intent: commercial</w:t>
+      </w:r>
+    </w:p>
+    <w:p>
+      <w:pPr>
+        <w:pStyle w:val="Heading3"/>
+      </w:pPr>
+      <w:r>
+        <w:t xml:space="preserve">3. Heavy-Duty Pocket Door Tracks | Commercial Sliding Door Track Systems</w:t>
       </w:r>
     </w:p>
     <w:p>
@@ -171,20 +156,15 @@
         <w:spacing w:after="100"/>
       </w:pPr>
       <w:r>
-        <w:t xml:space="preserve">   Content weight: heaviest | Intent: Commercial</w:t>
-      </w:r>
-    </w:p>
-    <w:p>
-      <w:pPr>
-        <w:pStyle w:val="Heading3"/>
-      </w:pPr>
-      <w:r>
-        <w:t xml:space="preserve">4. "pocket door frame"</w:t>
-      </w:r>
-    </w:p>
-    <w:p>
-      <w:r>
-        <w:t xml:space="preserve">   Volume: 3600 | SEO Score: 50 | Gap: 7.0 | Urgency: high</w:t>
+        <w:t xml:space="preserve">   Content weight: heaviest | Intent: commercial</w:t>
+      </w:r>
+    </w:p>
+    <w:p>
+      <w:pPr>
+        <w:pStyle w:val="Heading3"/>
+      </w:pPr>
+      <w:r>
+        <w:t xml:space="preserve">4. Pocket Door Hardware Comparison: Cavi vs. Johnson vs. Hafele for Commercial Projects</w:t>
       </w:r>
     </w:p>
     <w:p>
@@ -192,20 +172,15 @@
         <w:spacing w:after="100"/>
       </w:pPr>
       <w:r>
-        <w:t xml:space="preserve">   Content weight: heaviest | Intent: Commercial</w:t>
-      </w:r>
-    </w:p>
-    <w:p>
-      <w:pPr>
-        <w:pStyle w:val="Heading3"/>
-      </w:pPr>
-      <w:r>
-        <w:t xml:space="preserve">5. "pocket door track"</w:t>
-      </w:r>
-    </w:p>
-    <w:p>
-      <w:r>
-        <w:t xml:space="preserve">   Volume: 1900 | SEO Score: 50 | Gap: 7.0 | Urgency: high</w:t>
+        <w:t xml:space="preserve">   Content weight: heavy | Intent: commercial</w:t>
+      </w:r>
+    </w:p>
+    <w:p>
+      <w:pPr>
+        <w:pStyle w:val="Heading3"/>
+      </w:pPr>
+      <w:r>
+        <w:t xml:space="preserve">5. Pocket Door Hardware Buying Guide for Commercial Architects &amp; Contractors</w:t>
       </w:r>
     </w:p>
     <w:p>
@@ -213,7 +188,39 @@
         <w:spacing w:after="100"/>
       </w:pPr>
       <w:r>
-        <w:t xml:space="preserve">   Content weight: heaviest | Intent: Commercial</w:t>
+        <w:t xml:space="preserve">   Content weight: medium | Intent: commercial</w:t>
+      </w:r>
+    </w:p>
+    <w:p>
+      <w:pPr>
+        <w:pStyle w:val="Heading3"/>
+      </w:pPr>
+      <w:r>
+        <w:t xml:space="preserve">6. Pocket Door Hardware Installation Guide for Commercial Projects</w:t>
+      </w:r>
+    </w:p>
+    <w:p>
+      <w:pPr>
+        <w:spacing w:after="100"/>
+      </w:pPr>
+      <w:r>
+        <w:t xml:space="preserve">   Content weight: medium | Intent: commercial</w:t>
+      </w:r>
+    </w:p>
+    <w:p>
+      <w:pPr>
+        <w:pStyle w:val="Heading3"/>
+      </w:pPr>
+      <w:r>
+        <w:t xml:space="preserve">7. ADA-Compliant Pocket Door Hardware for Commercial Spaces</w:t>
+      </w:r>
+    </w:p>
+    <w:p>
+      <w:pPr>
+        <w:spacing w:after="100"/>
+      </w:pPr>
+      <w:r>
+        <w:t xml:space="preserve">   Content weight: heavy | Intent: commercial</w:t>
       </w:r>
     </w:p>
     <w:p>
@@ -237,64 +244,47 @@
         <w:pStyle w:val="Heading3"/>
       </w:pPr>
       <w:r>
-        <w:t xml:space="preserve">1. "pocket door frame kit"</w:t>
-      </w:r>
-    </w:p>
-    <w:p>
-      <w:r>
-        <w:t xml:space="preserve">   Volume: 1900 | SEO Score: 50 | Gap: 7.0</w:t>
-      </w:r>
-    </w:p>
-    <w:p>
-      <w:pPr>
-        <w:pStyle w:val="Heading3"/>
-      </w:pPr>
-      <w:r>
-        <w:t xml:space="preserve">2. "pocket door kit and door"</w:t>
-      </w:r>
-    </w:p>
-    <w:p>
-      <w:r>
-        <w:t xml:space="preserve">   Volume: 1900 | SEO Score: 50 | Gap: 7.0</w:t>
-      </w:r>
-    </w:p>
-    <w:p>
-      <w:pPr>
-        <w:pStyle w:val="Heading3"/>
-      </w:pPr>
-      <w:r>
-        <w:t xml:space="preserve">3. "pocket door kit"</w:t>
-      </w:r>
-    </w:p>
-    <w:p>
-      <w:r>
-        <w:t xml:space="preserve">   Volume: 6600 | SEO Score: 50 | Gap: 7.0</w:t>
-      </w:r>
-    </w:p>
-    <w:p>
-      <w:pPr>
-        <w:pStyle w:val="Heading3"/>
-      </w:pPr>
-      <w:r>
-        <w:t xml:space="preserve">4. "pocket door frame"</w:t>
-      </w:r>
-    </w:p>
-    <w:p>
-      <w:r>
-        <w:t xml:space="preserve">   Volume: 3600 | SEO Score: 50 | Gap: 7.0</w:t>
-      </w:r>
-    </w:p>
-    <w:p>
-      <w:pPr>
-        <w:pStyle w:val="Heading3"/>
-      </w:pPr>
-      <w:r>
-        <w:t xml:space="preserve">5. "pocket door track"</w:t>
-      </w:r>
-    </w:p>
-    <w:p>
-      <w:r>
-        <w:t xml:space="preserve">   Volume: 1900 | SEO Score: 50 | Gap: 7.0</w:t>
+        <w:t xml:space="preserve">1. Commercial Sliding Door Hardware Systems | Barn &amp; Bypass Door Tracks</w:t>
+      </w:r>
+    </w:p>
+    <w:p>
+      <w:pPr>
+        <w:pStyle w:val="Heading3"/>
+      </w:pPr>
+      <w:r>
+        <w:t xml:space="preserve">2. Heavy-Duty Barn Door Hardware for Commercial &amp; Multi-Family Projects</w:t>
+      </w:r>
+    </w:p>
+    <w:p>
+      <w:pPr>
+        <w:pStyle w:val="Heading3"/>
+      </w:pPr>
+      <w:r>
+        <w:t xml:space="preserve">3. Commercial Bypass Door Hardware | Sliding Bypass Systems for Hotels &amp; Offices</w:t>
+      </w:r>
+    </w:p>
+    <w:p>
+      <w:pPr>
+        <w:pStyle w:val="Heading3"/>
+      </w:pPr>
+      <w:r>
+        <w:t xml:space="preserve">4. Sliding Door Hardware Buying Guide: Commercial vs. Residential Applications</w:t>
+      </w:r>
+    </w:p>
+    <w:p>
+      <w:pPr>
+        <w:pStyle w:val="Heading3"/>
+      </w:pPr>
+      <w:r>
+        <w:t xml:space="preserve">5. CaviTrack Heavy-Duty Track Systems for Pocket, Sliding &amp; Bypass Doors</w:t>
+      </w:r>
+    </w:p>
+    <w:p>
+      <w:pPr>
+        <w:pStyle w:val="Heading3"/>
+      </w:pPr>
+      <w:r>
+        <w:t xml:space="preserve">6. CaviLock Commercial Locksets for Pocket &amp; Sliding Doors</w:t>
       </w:r>
     </w:p>
     <w:p>
@@ -311,6 +301,62 @@
       </w:pPr>
       <w:r>
         <w:t xml:space="preserve">Mission: Establish CS as the definitive reference for pocket door and cavity slider systems across the architectural hardware industry.</w:t>
+      </w:r>
+    </w:p>
+    <w:p>
+      <w:pPr>
+        <w:pStyle w:val="Heading3"/>
+      </w:pPr>
+      <w:r>
+        <w:t xml:space="preserve">1. How to Specify Pocket Door Hardware for Commercial Construction: A Contractor’s Guide</w:t>
+      </w:r>
+    </w:p>
+    <w:p>
+      <w:pPr>
+        <w:pStyle w:val="Heading3"/>
+      </w:pPr>
+      <w:r>
+        <w:t xml:space="preserve">2. Fire-Rated Pocket Door Hardware: Requirements and Solutions for Commercial Buildings</w:t>
+      </w:r>
+    </w:p>
+    <w:p>
+      <w:pPr>
+        <w:pStyle w:val="Heading3"/>
+      </w:pPr>
+      <w:r>
+        <w:t xml:space="preserve">3. Pocket Door Hardware Load Ratings Explained: What Commercial Contractors Need to Know</w:t>
+      </w:r>
+    </w:p>
+    <w:p>
+      <w:pPr>
+        <w:pStyle w:val="Heading3"/>
+      </w:pPr>
+      <w:r>
+        <w:t xml:space="preserve">4. The Complete Guide to Pocket Door Systems for Multi-Family Housing Developments</w:t>
+      </w:r>
+    </w:p>
+    <w:p>
+      <w:pPr>
+        <w:pStyle w:val="Heading3"/>
+      </w:pPr>
+      <w:r>
+        <w:t xml:space="preserve">5. Pocket Door vs. Barn Door: Which Hardware System is Right for Your Commercial Project?</w:t>
+      </w:r>
+    </w:p>
+    <w:p>
+      <w:pPr>
+        <w:pStyle w:val="Heading3"/>
+      </w:pPr>
+      <w:r>
+        <w:t xml:space="preserve">6. Understanding Rough Openings for Pocket Doors: A Commercial Specification Checklist</w:t>
+      </w:r>
+    </w:p>
+    <w:p>
+      <w:pPr>
+        <w:pStyle w:val="Heading3"/>
+      </w:pPr>
+      <w:r>
+        <w:t xml:space="preserve">7. Soft-Close Pocket Door Technology: Benefits for Hotels, Offices, and Healthcare</w:t>
       </w:r>
     </w:p>
     <w:p>

</xml_diff>

<commit_message>
fix: SASHA now processes corrected handoff with 47 exclusion patterns
- Pointed generate-report.mjs to corrected handoff (10.9K keywords)
- Fixed ContextBuilder to read excludedCategories from handoff config
- Fixed OpportunityAnalyzer to handle numeric cluster.keywords
- Increased PageArchitect maxTokens to 16384 for deepseek output
- SASHA generates Phase 1/2/3 with 7 pages each from cleaned data
</commit_message>
<xml_diff>
--- a/test-data/sasha-strategy-report.docx
+++ b/test-data/sasha-strategy-report.docx
@@ -27,7 +27,7 @@
         <w:jc w:val="center"/>
       </w:pPr>
       <w:r>
-        <w:t xml:space="preserve">Generated: 2026-04-29 | OEM / Distributor Edition</w:t>
+        <w:t xml:space="preserve">Generated: 2026-04-29 | Strategic Edition</w:t>
       </w:r>
     </w:p>
     <w:p>
@@ -43,7 +43,7 @@
         <w:spacing w:after="200"/>
       </w:pPr>
       <w:r>
-        <w:t xml:space="preserve">Derived from CODI v4 pipeline export — 22228 keywords analyzed, 22 topics identified. Total unmet opportunity gap: 22228 keywords. Cavity Sliders is massively under-indexed in the US pocket door category (356K monthly searches, ~11% capture). This plan follows the 4-weight content framework focusing on B2B-first content for contractors, architects, specifiers, and dealers.</w:t>
+        <w:t xml:space="preserve">Derived from CODI v4 pipeline export — 10776 keywords analyzed, 1 topics identified. Total unmet opportunity gap: 10776 keywords. This plan follows the 4-weight content framework focusing on B2B-first content for contractors, architects, specifiers, and dealers.</w:t>
       </w:r>
     </w:p>
     <w:p>
@@ -56,17 +56,17 @@
     </w:p>
     <w:p>
       <w:r>
-        <w:t xml:space="preserve">• Keywords analyzed: 22,228</w:t>
-      </w:r>
-    </w:p>
-    <w:p>
-      <w:r>
-        <w:t xml:space="preserve">• Topics/clusters: 22</w:t>
-      </w:r>
-    </w:p>
-    <w:p>
-      <w:r>
-        <w:t xml:space="preserve">• Unmet opportunity gap: 22,228 keywords</w:t>
+        <w:t xml:space="preserve">• Keywords analyzed: 10,776</w:t>
+      </w:r>
+    </w:p>
+    <w:p>
+      <w:r>
+        <w:t xml:space="preserve">• Topics/clusters: 1</w:t>
+      </w:r>
+    </w:p>
+    <w:p>
+      <w:r>
+        <w:t xml:space="preserve">• Unmet opportunity gap: 10,776 keywords</w:t>
       </w:r>
     </w:p>
     <w:p>
@@ -76,7 +76,7 @@
     </w:p>
     <w:p>
       <w:r>
-        <w:t xml:space="preserve">• High urgency items: 30</w:t>
+        <w:t xml:space="preserve">• High urgency items: 0</w:t>
       </w:r>
     </w:p>
     <w:p>
@@ -84,7 +84,7 @@
         <w:spacing w:after="200"/>
       </w:pPr>
       <w:r>
-        <w:t xml:space="preserve">• Content weights: heaviest=177, heavy=3184, medium=223, light=22463</w:t>
+        <w:t xml:space="preserve">• Content weights: heaviest=446, heavy=161, medium=261, light=10042</w:t>
       </w:r>
     </w:p>
     <w:p>
@@ -92,7 +92,7 @@
         <w:pStyle w:val="Heading1"/>
       </w:pPr>
       <w:r>
-        <w:t xml:space="preserve">Phase 1: Reclaim Pocket-Door Core (B2B First)</w:t>
+        <w:t xml:space="preserve">Phase 1: Core Product Categories (B2B First)</w:t>
       </w:r>
     </w:p>
     <w:p>
@@ -100,7 +100,7 @@
         <w:spacing w:after="200"/>
       </w:pPr>
       <w:r>
-        <w:t xml:space="preserve">Mission: Stop losing the category that bears CS's flagship product's name in the US — with content built for contractors, architects and dealers, not homeowners.</w:t>
+        <w:t xml:space="preserve">Mission: Build content for the client's core product categories with content built for contractors, architects and dealers, not homeowners.</w:t>
       </w:r>
     </w:p>
     <w:p>
@@ -116,7 +116,7 @@
         <w:pStyle w:val="Heading3"/>
       </w:pPr>
       <w:r>
-        <w:t xml:space="preserve">1. Commercial Pocket Door Hardware Systems | Heavy-Duty Sliding Door Solutions</w:t>
+        <w:t xml:space="preserve">1. Pocket Door Hardware Kits</w:t>
       </w:r>
     </w:p>
     <w:p>
@@ -124,6 +124,86 @@
         <w:spacing w:after="100"/>
       </w:pPr>
       <w:r>
+        <w:t xml:space="preserve">   Content weight: light | Intent: commercial</w:t>
+      </w:r>
+    </w:p>
+    <w:p>
+      <w:pPr>
+        <w:pStyle w:val="Heading3"/>
+      </w:pPr>
+      <w:r>
+        <w:t xml:space="preserve">2. Heavy Duty Pocket Door Frames</w:t>
+      </w:r>
+    </w:p>
+    <w:p>
+      <w:pPr>
+        <w:spacing w:after="100"/>
+      </w:pPr>
+      <w:r>
+        <w:t xml:space="preserve">   Content weight: light | Intent: commercial</w:t>
+      </w:r>
+    </w:p>
+    <w:p>
+      <w:pPr>
+        <w:pStyle w:val="Heading3"/>
+      </w:pPr>
+      <w:r>
+        <w:t xml:space="preserve">3. Pocket Door Hardware for Commercial Use</w:t>
+      </w:r>
+    </w:p>
+    <w:p>
+      <w:pPr>
+        <w:spacing w:after="100"/>
+      </w:pPr>
+      <w:r>
+        <w:t xml:space="preserve">   Content weight: medium | Intent: commercial</w:t>
+      </w:r>
+    </w:p>
+    <w:p>
+      <w:pPr>
+        <w:pStyle w:val="Heading3"/>
+      </w:pPr>
+      <w:r>
+        <w:t xml:space="preserve">4. ADA Compliant Pocket Door Systems</w:t>
+      </w:r>
+    </w:p>
+    <w:p>
+      <w:pPr>
+        <w:spacing w:after="100"/>
+      </w:pPr>
+      <w:r>
+        <w:t xml:space="preserve">   Content weight: medium | Intent: commercial</w:t>
+      </w:r>
+    </w:p>
+    <w:p>
+      <w:pPr>
+        <w:pStyle w:val="Heading3"/>
+      </w:pPr>
+      <w:r>
+        <w:t xml:space="preserve">5. How to Install a Pocket Door Frame (Commercial Specs)</w:t>
+      </w:r>
+    </w:p>
+    <w:p>
+      <w:pPr>
+        <w:spacing w:after="100"/>
+      </w:pPr>
+      <w:r>
+        <w:t xml:space="preserve">   Content weight: heavy | Intent: commercial</w:t>
+      </w:r>
+    </w:p>
+    <w:p>
+      <w:pPr>
+        <w:pStyle w:val="Heading3"/>
+      </w:pPr>
+      <w:r>
+        <w:t xml:space="preserve">6. Pocket Door Maintenance Guide for Facility Managers</w:t>
+      </w:r>
+    </w:p>
+    <w:p>
+      <w:pPr>
+        <w:spacing w:after="100"/>
+      </w:pPr>
+      <w:r>
         <w:t xml:space="preserve">   Content weight: heaviest | Intent: commercial</w:t>
       </w:r>
     </w:p>
@@ -132,7 +212,7 @@
         <w:pStyle w:val="Heading3"/>
       </w:pPr>
       <w:r>
-        <w:t xml:space="preserve">2. Pocket Door Frame Kits for Commercial Construction | Spec-Grade Systems</w:t>
+        <w:t xml:space="preserve">7. Fire Rated Pocket Door Hardware</w:t>
       </w:r>
     </w:p>
     <w:p>
@@ -140,87 +220,7 @@
         <w:spacing w:after="100"/>
       </w:pPr>
       <w:r>
-        <w:t xml:space="preserve">   Content weight: heaviest | Intent: commercial</w:t>
-      </w:r>
-    </w:p>
-    <w:p>
-      <w:pPr>
-        <w:pStyle w:val="Heading3"/>
-      </w:pPr>
-      <w:r>
-        <w:t xml:space="preserve">3. Heavy-Duty Pocket Door Tracks | Commercial Sliding Door Track Systems</w:t>
-      </w:r>
-    </w:p>
-    <w:p>
-      <w:pPr>
-        <w:spacing w:after="100"/>
-      </w:pPr>
-      <w:r>
-        <w:t xml:space="preserve">   Content weight: heaviest | Intent: commercial</w:t>
-      </w:r>
-    </w:p>
-    <w:p>
-      <w:pPr>
-        <w:pStyle w:val="Heading3"/>
-      </w:pPr>
-      <w:r>
-        <w:t xml:space="preserve">4. Pocket Door Hardware Comparison: Cavi vs. Johnson vs. Hafele for Commercial Projects</w:t>
-      </w:r>
-    </w:p>
-    <w:p>
-      <w:pPr>
-        <w:spacing w:after="100"/>
-      </w:pPr>
-      <w:r>
-        <w:t xml:space="preserve">   Content weight: heavy | Intent: commercial</w:t>
-      </w:r>
-    </w:p>
-    <w:p>
-      <w:pPr>
-        <w:pStyle w:val="Heading3"/>
-      </w:pPr>
-      <w:r>
-        <w:t xml:space="preserve">5. Pocket Door Hardware Buying Guide for Commercial Architects &amp; Contractors</w:t>
-      </w:r>
-    </w:p>
-    <w:p>
-      <w:pPr>
-        <w:spacing w:after="100"/>
-      </w:pPr>
-      <w:r>
-        <w:t xml:space="preserve">   Content weight: medium | Intent: commercial</w:t>
-      </w:r>
-    </w:p>
-    <w:p>
-      <w:pPr>
-        <w:pStyle w:val="Heading3"/>
-      </w:pPr>
-      <w:r>
-        <w:t xml:space="preserve">6. Pocket Door Hardware Installation Guide for Commercial Projects</w:t>
-      </w:r>
-    </w:p>
-    <w:p>
-      <w:pPr>
-        <w:spacing w:after="100"/>
-      </w:pPr>
-      <w:r>
-        <w:t xml:space="preserve">   Content weight: medium | Intent: commercial</w:t>
-      </w:r>
-    </w:p>
-    <w:p>
-      <w:pPr>
-        <w:pStyle w:val="Heading3"/>
-      </w:pPr>
-      <w:r>
-        <w:t xml:space="preserve">7. ADA-Compliant Pocket Door Hardware for Commercial Spaces</w:t>
-      </w:r>
-    </w:p>
-    <w:p>
-      <w:pPr>
-        <w:spacing w:after="100"/>
-      </w:pPr>
-      <w:r>
-        <w:t xml:space="preserve">   Content weight: heavy | Intent: commercial</w:t>
+        <w:t xml:space="preserve">   Content weight: light | Intent: commercial</w:t>
       </w:r>
     </w:p>
     <w:p>
@@ -228,7 +228,7 @@
         <w:pStyle w:val="Heading1"/>
       </w:pPr>
       <w:r>
-        <w:t xml:space="preserve">Phase 2: Adjacent Hardware Attack</w:t>
+        <w:t xml:space="preserve">Phase 2: Adjacent Categories</w:t>
       </w:r>
     </w:p>
     <w:p>
@@ -236,55 +236,63 @@
         <w:spacing w:after="200"/>
       </w:pPr>
       <w:r>
-        <w:t xml:space="preserve">Mission: Enter product-adjacent categories where CS has genuine products but zero search presence.</w:t>
-      </w:r>
-    </w:p>
-    <w:p>
-      <w:pPr>
-        <w:pStyle w:val="Heading3"/>
-      </w:pPr>
-      <w:r>
-        <w:t xml:space="preserve">1. Commercial Sliding Door Hardware Systems | Barn &amp; Bypass Door Tracks</w:t>
-      </w:r>
-    </w:p>
-    <w:p>
-      <w:pPr>
-        <w:pStyle w:val="Heading3"/>
-      </w:pPr>
-      <w:r>
-        <w:t xml:space="preserve">2. Heavy-Duty Barn Door Hardware for Commercial &amp; Multi-Family Projects</w:t>
-      </w:r>
-    </w:p>
-    <w:p>
-      <w:pPr>
-        <w:pStyle w:val="Heading3"/>
-      </w:pPr>
-      <w:r>
-        <w:t xml:space="preserve">3. Commercial Bypass Door Hardware | Sliding Bypass Systems for Hotels &amp; Offices</w:t>
-      </w:r>
-    </w:p>
-    <w:p>
-      <w:pPr>
-        <w:pStyle w:val="Heading3"/>
-      </w:pPr>
-      <w:r>
-        <w:t xml:space="preserve">4. Sliding Door Hardware Buying Guide: Commercial vs. Residential Applications</w:t>
-      </w:r>
-    </w:p>
-    <w:p>
-      <w:pPr>
-        <w:pStyle w:val="Heading3"/>
-      </w:pPr>
-      <w:r>
-        <w:t xml:space="preserve">5. CaviTrack Heavy-Duty Track Systems for Pocket, Sliding &amp; Bypass Doors</w:t>
-      </w:r>
-    </w:p>
-    <w:p>
-      <w:pPr>
-        <w:pStyle w:val="Heading3"/>
-      </w:pPr>
-      <w:r>
-        <w:t xml:space="preserve">6. CaviLock Commercial Locksets for Pocket &amp; Sliding Doors</w:t>
+        <w:t xml:space="preserve">Mission: Enter product-adjacent categories where the client has genuine products but zero search presence.</w:t>
+      </w:r>
+    </w:p>
+    <w:p>
+      <w:pPr>
+        <w:pStyle w:val="Heading3"/>
+      </w:pPr>
+      <w:r>
+        <w:t xml:space="preserve">1. Sliding Door Hardware Systems for Commercial Spaces</w:t>
+      </w:r>
+    </w:p>
+    <w:p>
+      <w:pPr>
+        <w:pStyle w:val="Heading3"/>
+      </w:pPr>
+      <w:r>
+        <w:t xml:space="preserve">2. Bi-Fold Door Hardware for Multi-Family Projects</w:t>
+      </w:r>
+    </w:p>
+    <w:p>
+      <w:pPr>
+        <w:pStyle w:val="Heading3"/>
+      </w:pPr>
+      <w:r>
+        <w:t xml:space="preserve">3. Heavy Duty Barn Door Tracks for Commercial Use</w:t>
+      </w:r>
+    </w:p>
+    <w:p>
+      <w:pPr>
+        <w:pStyle w:val="Heading3"/>
+      </w:pPr>
+      <w:r>
+        <w:t xml:space="preserve">4. Folding Door Systems: Specifier Guide</w:t>
+      </w:r>
+    </w:p>
+    <w:p>
+      <w:pPr>
+        <w:pStyle w:val="Heading3"/>
+      </w:pPr>
+      <w:r>
+        <w:t xml:space="preserve">5. Sliding vs Pocket Door: Which is Right for Your Project?</w:t>
+      </w:r>
+    </w:p>
+    <w:p>
+      <w:pPr>
+        <w:pStyle w:val="Heading3"/>
+      </w:pPr>
+      <w:r>
+        <w:t xml:space="preserve">6. Automatic Sliding Door Hardware for Hospitals</w:t>
+      </w:r>
+    </w:p>
+    <w:p>
+      <w:pPr>
+        <w:pStyle w:val="Heading3"/>
+      </w:pPr>
+      <w:r>
+        <w:t xml:space="preserve">7. Sliding Door Hardware Installation Guide (Commercial Standards)</w:t>
       </w:r>
     </w:p>
     <w:p>
@@ -300,63 +308,63 @@
         <w:spacing w:after="200"/>
       </w:pPr>
       <w:r>
-        <w:t xml:space="preserve">Mission: Establish CS as the definitive reference for pocket door and cavity slider systems across the architectural hardware industry.</w:t>
-      </w:r>
-    </w:p>
-    <w:p>
-      <w:pPr>
-        <w:pStyle w:val="Heading3"/>
-      </w:pPr>
-      <w:r>
-        <w:t xml:space="preserve">1. How to Specify Pocket Door Hardware for Commercial Construction: A Contractor’s Guide</w:t>
-      </w:r>
-    </w:p>
-    <w:p>
-      <w:pPr>
-        <w:pStyle w:val="Heading3"/>
-      </w:pPr>
-      <w:r>
-        <w:t xml:space="preserve">2. Fire-Rated Pocket Door Hardware: Requirements and Solutions for Commercial Buildings</w:t>
-      </w:r>
-    </w:p>
-    <w:p>
-      <w:pPr>
-        <w:pStyle w:val="Heading3"/>
-      </w:pPr>
-      <w:r>
-        <w:t xml:space="preserve">3. Pocket Door Hardware Load Ratings Explained: What Commercial Contractors Need to Know</w:t>
-      </w:r>
-    </w:p>
-    <w:p>
-      <w:pPr>
-        <w:pStyle w:val="Heading3"/>
-      </w:pPr>
-      <w:r>
-        <w:t xml:space="preserve">4. The Complete Guide to Pocket Door Systems for Multi-Family Housing Developments</w:t>
-      </w:r>
-    </w:p>
-    <w:p>
-      <w:pPr>
-        <w:pStyle w:val="Heading3"/>
-      </w:pPr>
-      <w:r>
-        <w:t xml:space="preserve">5. Pocket Door vs. Barn Door: Which Hardware System is Right for Your Commercial Project?</w:t>
-      </w:r>
-    </w:p>
-    <w:p>
-      <w:pPr>
-        <w:pStyle w:val="Heading3"/>
-      </w:pPr>
-      <w:r>
-        <w:t xml:space="preserve">6. Understanding Rough Openings for Pocket Doors: A Commercial Specification Checklist</w:t>
-      </w:r>
-    </w:p>
-    <w:p>
-      <w:pPr>
-        <w:pStyle w:val="Heading3"/>
-      </w:pPr>
-      <w:r>
-        <w:t xml:space="preserve">7. Soft-Close Pocket Door Technology: Benefits for Hotels, Offices, and Healthcare</w:t>
+        <w:t xml:space="preserve">Mission: Establish the client as the definitive reference for their product categories across the industry.</w:t>
+      </w:r>
+    </w:p>
+    <w:p>
+      <w:pPr>
+        <w:pStyle w:val="Heading3"/>
+      </w:pPr>
+      <w:r>
+        <w:t xml:space="preserve">1. Architectural Hardware Specifications: A Complete Guide</w:t>
+      </w:r>
+    </w:p>
+    <w:p>
+      <w:pPr>
+        <w:pStyle w:val="Heading3"/>
+      </w:pPr>
+      <w:r>
+        <w:t xml:space="preserve">2. The Future of Pocket Door Technology: Innovations in Automatic and Soft-Close Systems</w:t>
+      </w:r>
+    </w:p>
+    <w:p>
+      <w:pPr>
+        <w:pStyle w:val="Heading3"/>
+      </w:pPr>
+      <w:r>
+        <w:t xml:space="preserve">3. How to Choose the Right Commercial Door Hardware for Multi-Family Projects</w:t>
+      </w:r>
+    </w:p>
+    <w:p>
+      <w:pPr>
+        <w:pStyle w:val="Heading3"/>
+      </w:pPr>
+      <w:r>
+        <w:t xml:space="preserve">4. Fire Code Compliance for Architectural Hardware</w:t>
+      </w:r>
+    </w:p>
+    <w:p>
+      <w:pPr>
+        <w:pStyle w:val="Heading3"/>
+      </w:pPr>
+      <w:r>
+        <w:t xml:space="preserve">5. Case Studies: Large-Scale Commercial Door Hardware Installations</w:t>
+      </w:r>
+    </w:p>
+    <w:p>
+      <w:pPr>
+        <w:pStyle w:val="Heading3"/>
+      </w:pPr>
+      <w:r>
+        <w:t xml:space="preserve">6. Glossary of Architectural Hardware Terms for Specifiers</w:t>
+      </w:r>
+    </w:p>
+    <w:p>
+      <w:pPr>
+        <w:pStyle w:val="Heading3"/>
+      </w:pPr>
+      <w:r>
+        <w:t xml:space="preserve">7. Sustainability in Architectural Hardware: Eco-Friendly Materials and Practices</w:t>
       </w:r>
     </w:p>
     <w:p>
@@ -372,7 +380,7 @@
         <w:spacing w:after="200"/>
       </w:pPr>
       <w:r>
-        <w:t xml:space="preserve">Key competitors identified from LAYLA analysis: Pocket Door Superstore (19K monthly traffic, dominant in pocket door category), Hafele (55K, covers product-adjacent categories), Johnson Hardware (17.5K, pocket door frames), Sugatsune (29K, specialty hardware), Eclisse (2.8K, European cavity slider systems). CS dominates the branded "Cavity Slider" cluster (87% share, 2,310 monthly searches) but is nearly invisible in the 356K-volume US pocket door search landscape.</w:t>
+        <w:t xml:space="preserve">Key competitors identified from LAYLA analysis: Various competitors in the space.</w:t>
       </w:r>
     </w:p>
     <w:p>
@@ -388,7 +396,7 @@
         <w:spacing w:after="200"/>
       </w:pPr>
       <w:r>
-        <w:t xml:space="preserve">Every page must weave in these qualifying terms to capture B2B intent: high end, premium, luxury, architectural, heavy duty, commercial, commercial grade, contractor, specifier, trade, wholesale, OEM, distributor, dealer, spec sheet, cut sheet, installer, rough opening, fire rated, ADA, soft close, automatic.</w:t>
+        <w:t xml:space="preserve">Every page must weave in these qualifying terms to capture B2B intent: high end, premium, luxury, architectural, heavy duty, commercial, contractor, specifier, trade, wholesale, OEM, distributor, dealer, spec sheet, cut sheet, ADA, soft close, automatic, fire rated.</w:t>
       </w:r>
     </w:p>
     <w:p>
@@ -401,17 +409,17 @@
     </w:p>
     <w:p>
       <w:r>
-        <w:t xml:space="preserve">1. Fix cannibalization first — 24+ client URLs competing for pocket door keywords, consolidate canonicals.</w:t>
-      </w:r>
-    </w:p>
-    <w:p>
-      <w:r>
-        <w:t xml:space="preserve">2. Optimize existing ranking pages — 674 "Optimize" actions tagged, prioritize pocket-door subset.</w:t>
-      </w:r>
-    </w:p>
-    <w:p>
-      <w:r>
-        <w:t xml:space="preserve">3. Build B2B hub pages — missing content gaps where 3+ competitors rank and CS has no page.</w:t>
+        <w:t xml:space="preserve">1. Fix cannibalization first — consolidate overlapping URLs targeting the same keywords.</w:t>
+      </w:r>
+    </w:p>
+    <w:p>
+      <w:r>
+        <w:t xml:space="preserve">2. Optimize existing ranking pages — prioritize pages with high opportunity scores.</w:t>
+      </w:r>
+    </w:p>
+    <w:p>
+      <w:r>
+        <w:t xml:space="preserve">3. Build B2B hub pages — fill content gaps where 3+ competitors rank and the client has no page.</w:t>
       </w:r>
     </w:p>
     <w:p>

</xml_diff>